<commit_message>
Publica template Franca por Marcos
</commit_message>
<xml_diff>
--- a/templates/ribeirao_preto_9fa5134b.docx
+++ b/templates/ribeirao_preto_9fa5134b.docx
@@ -11,9 +11,7 @@
         <w:rPr>
           <w:rFonts w:ascii="Arial" w:hAnsi="Arial" w:eastAsia="Arial" w:cs="Arial"/>
           <w:b/>
-          <w:i w:val="0"/>
           <w:sz w:val="20"/>
-          <w:u w:val="none"/>
         </w:rPr>
         <w:t>DECLARAÇÃO</w:t>
       </w:r>
@@ -27,9 +25,7 @@
         <w:rPr>
           <w:rFonts w:ascii="Arial" w:hAnsi="Arial" w:eastAsia="Arial" w:cs="Arial"/>
           <w:b w:val="0"/>
-          <w:i w:val="0"/>
           <w:sz w:val="20"/>
-          <w:u w:val="none"/>
         </w:rPr>
         <w:t>À</w:t>
       </w:r>
@@ -43,11 +39,9 @@
         <w:rPr>
           <w:rFonts w:ascii="Arial" w:hAnsi="Arial" w:eastAsia="Arial" w:cs="Arial"/>
           <w:b w:val="0"/>
-          <w:i w:val="0"/>
           <w:sz w:val="20"/>
-          <w:u w:val="none"/>
         </w:rPr>
-        <w:t>SINDICATO DOS TRABALHADORES NO COMERCIO E SERVIÇOS EM GASTRONOMIA, ALIMENTOS PREPARADOS, FAST FOODS, BEBIDAS A VAREJO E MEIOS DE HOSPEDAGEM DE ARARAQUARA E REGIAO - SINTRAGASTROH-ARA</w:t>
+        <w:t>SINDICATO DOS TRABALHADORES EM HOTEIS, RESTAURANTES, BARES E SIMILARES DE RIBEIRAO PRETO REGIAO (a/c.: Giovana).</w:t>
       </w:r>
     </w:p>
     <w:p>
@@ -59,9 +53,7 @@
         <w:rPr>
           <w:rFonts w:ascii="Arial" w:hAnsi="Arial" w:eastAsia="Arial" w:cs="Arial"/>
           <w:b w:val="0"/>
-          <w:i w:val="0"/>
           <w:sz w:val="20"/>
-          <w:u w:val="none"/>
         </w:rPr>
         <w:t>e</w:t>
       </w:r>
@@ -75,12 +67,17 @@
         <w:rPr>
           <w:rFonts w:ascii="Arial" w:hAnsi="Arial" w:eastAsia="Arial" w:cs="Arial"/>
           <w:b w:val="0"/>
-          <w:i w:val="0"/>
           <w:sz w:val="20"/>
-          <w:u w:val="none"/>
         </w:rPr>
-        <w:t>SINDICATO DE HOTEIS, RESTAURANTES, BARES E SIMILARES DE ARARAQUARA E REGIAO - SINHORES</w:t>
+        <w:t>SINDICATO DE HOTEIS, RESTAURANTES, BARES E SIMILARES DE RIBEIRAO PRETO E REGIAO (a/c.: Junior).</w:t>
       </w:r>
+    </w:p>
+    <w:p>
+      <w:pPr>
+        <w:spacing w:before="0" w:after="0" w:line="240" w:lineRule="auto"/>
+        <w:jc w:val="both"/>
+      </w:pPr>
+      <w:r/>
     </w:p>
     <w:p>
       <w:pPr>
@@ -91,11 +88,49 @@
         <w:rPr>
           <w:rFonts w:ascii="Arial" w:hAnsi="Arial" w:eastAsia="Arial" w:cs="Arial"/>
           <w:b w:val="0"/>
-          <w:i w:val="0"/>
           <w:sz w:val="20"/>
-          <w:u w:val="none"/>
         </w:rPr>
+        <w:t xml:space="preserve">Declaramos que a empresa </w:t>
       </w:r>
+      <w:r>
+        <w:rPr>
+          <w:rFonts w:ascii="Arial" w:hAnsi="Arial" w:eastAsia="Arial" w:cs="Arial"/>
+          <w:b/>
+          <w:sz w:val="20"/>
+        </w:rPr>
+        <w:t>{{EMPRESA}} - {{CNPJ}}</w:t>
+      </w:r>
+      <w:r>
+        <w:rPr>
+          <w:rFonts w:ascii="Arial" w:hAnsi="Arial" w:eastAsia="Arial" w:cs="Arial"/>
+          <w:b w:val="0"/>
+          <w:sz w:val="20"/>
+        </w:rPr>
+        <w:t xml:space="preserve"> fez a ADESAO da Cesta de Beneficios, tendo contratado o </w:t>
+      </w:r>
+      <w:r>
+        <w:rPr>
+          <w:rFonts w:ascii="Arial" w:hAnsi="Arial" w:eastAsia="Arial" w:cs="Arial"/>
+          <w:b/>
+          <w:sz w:val="20"/>
+        </w:rPr>
+        <w:t>{{BLOCO_BENEFICIOS}}</w:t>
+      </w:r>
+      <w:r>
+        <w:rPr>
+          <w:rFonts w:ascii="Arial" w:hAnsi="Arial" w:eastAsia="Arial" w:cs="Arial"/>
+          <w:b w:val="0"/>
+          <w:sz w:val="20"/>
+        </w:rPr>
+        <w:t xml:space="preserve"> os quais atendem na integra a CLAUSULA CESTA DE BENEFICIOS.</w:t>
+      </w:r>
+    </w:p>
+    <w:p>
+      <w:pPr>
+        <w:spacing w:before="0" w:after="0" w:line="240" w:lineRule="auto"/>
+        <w:jc w:val="both"/>
+      </w:pPr>
+      <w:r/>
     </w:p>
     <w:p>
       <w:pPr>
@@ -106,72 +141,17 @@
         <w:rPr>
           <w:rFonts w:ascii="Arial" w:hAnsi="Arial" w:eastAsia="Arial" w:cs="Arial"/>
           <w:b w:val="0"/>
-          <w:i w:val="0"/>
           <w:sz w:val="20"/>
-          <w:u w:val="none"/>
         </w:rPr>
-        <w:t xml:space="preserve">Declaramos que a empresa </w:t>
+        <w:t>Informamos que a apolice do Seguro de Vida, bem como o Resumo de fatura do Plano Odontologico e suas respectivas carteirinhas estao em processo de emissao junto a Seguradora. Tao logo estejam disponiveis serao prontamente encaminhadas ao e-mail do nosso estimado cliente.</w:t>
       </w:r>
-      <w:r>
-        <w:rPr>
-          <w:rFonts w:ascii="Arial" w:hAnsi="Arial" w:eastAsia="Arial" w:cs="Arial"/>
-          <w:b w:val="0"/>
-          <w:i w:val="0"/>
-          <w:sz w:val="20"/>
-          <w:u w:val="none"/>
-        </w:rPr>
-        <w:t>{{EMPRESA}}</w:t>
-      </w:r>
-      <w:r>
-        <w:rPr>
-          <w:rFonts w:ascii="Arial" w:hAnsi="Arial" w:eastAsia="Arial" w:cs="Arial"/>
-          <w:b/>
-          <w:i w:val="0"/>
-          <w:sz w:val="20"/>
-          <w:u w:val="none"/>
-        </w:rPr>
-        <w:t xml:space="preserve"> - </w:t>
-      </w:r>
-      <w:r>
-        <w:rPr>
-          <w:rFonts w:ascii="Arial" w:hAnsi="Arial" w:eastAsia="Arial" w:cs="Arial"/>
-          <w:b w:val="0"/>
-          <w:i w:val="0"/>
-          <w:sz w:val="20"/>
-          <w:u w:val="none"/>
-        </w:rPr>
-        <w:t>{{CNPJ}}</w:t>
-      </w:r>
-      <w:r>
-        <w:rPr>
-          <w:rFonts w:ascii="Arial" w:hAnsi="Arial" w:eastAsia="Arial" w:cs="Arial"/>
-          <w:b w:val="0"/>
-          <w:i w:val="0"/>
-          <w:sz w:val="20"/>
-          <w:u w:val="none"/>
-        </w:rPr>
-        <w:t xml:space="preserve"> fez a ADESAO da Cesta de Beneficios, tendo contratado o </w:t>
-      </w:r>
-      <w:r>
-        <w:rPr>
-          <w:rFonts w:ascii="Arial" w:hAnsi="Arial" w:eastAsia="Arial" w:cs="Arial"/>
-          <w:b w:val="0"/>
-          <w:i w:val="0"/>
-          <w:sz w:val="20"/>
-          <w:u w:val="none"/>
-        </w:rPr>
-        <w:t>{{BLOCO_BENEFICIOS}}</w:t>
-      </w:r>
-      <w:r>
-        <w:rPr>
-          <w:rFonts w:ascii="Arial" w:hAnsi="Arial" w:eastAsia="Arial" w:cs="Arial"/>
-          <w:b w:val="0"/>
-          <w:i w:val="0"/>
-          <w:sz w:val="20"/>
-          <w:u w:val="none"/>
-        </w:rPr>
-        <w:t xml:space="preserve"> os quais atendem na integra a CLAUSULA CESTA DE BENEFICIOS.</w:t>
-      </w:r>
+    </w:p>
+    <w:p>
+      <w:pPr>
+        <w:spacing w:before="0" w:after="0" w:line="240" w:lineRule="auto"/>
+        <w:jc w:val="both"/>
+      </w:pPr>
+      <w:r/>
     </w:p>
     <w:p>
       <w:pPr>
@@ -182,11 +162,17 @@
         <w:rPr>
           <w:rFonts w:ascii="Arial" w:hAnsi="Arial" w:eastAsia="Arial" w:cs="Arial"/>
           <w:b w:val="0"/>
-          <w:i w:val="0"/>
           <w:sz w:val="20"/>
-          <w:u w:val="none"/>
         </w:rPr>
+        <w:t>A ATUALIZACAO da Cesta de Beneficios foi formalizada mediante o pagamento do boleto, realizado em {{PAGTO}}.</w:t>
       </w:r>
+    </w:p>
+    <w:p>
+      <w:pPr>
+        <w:spacing w:before="0" w:after="0" w:line="240" w:lineRule="auto"/>
+        <w:jc w:val="both"/>
+      </w:pPr>
+      <w:r/>
     </w:p>
     <w:p>
       <w:pPr>
@@ -197,12 +183,17 @@
         <w:rPr>
           <w:rFonts w:ascii="Arial" w:hAnsi="Arial" w:eastAsia="Arial" w:cs="Arial"/>
           <w:b w:val="0"/>
-          <w:i w:val="0"/>
           <w:sz w:val="20"/>
-          <w:u w:val="none"/>
         </w:rPr>
-        <w:t>Informamos que a apolice do Seguro de Vida, esta em processo de emissao junto a Seguradora. Tao logo estejam disponiveis serao prontamente encaminhadas ao e-mail do nosso estimado cliente.</w:t>
+        <w:t>A Cesta de Beneficios esta com estes funcionarios ATIVOS:</w:t>
       </w:r>
+    </w:p>
+    <w:p>
+      <w:pPr>
+        <w:spacing w:before="0" w:after="0" w:line="240" w:lineRule="auto"/>
+        <w:jc w:val="both"/>
+      </w:pPr>
+      <w:r/>
     </w:p>
     <w:p>
       <w:pPr>
@@ -213,106 +204,7 @@
         <w:rPr>
           <w:rFonts w:ascii="Arial" w:hAnsi="Arial" w:eastAsia="Arial" w:cs="Arial"/>
           <w:b w:val="0"/>
-          <w:i w:val="0"/>
           <w:sz w:val="20"/>
-          <w:u w:val="none"/>
-        </w:rPr>
-      </w:r>
-    </w:p>
-    <w:p>
-      <w:pPr>
-        <w:spacing w:before="0" w:after="0" w:line="240" w:lineRule="auto"/>
-        <w:jc w:val="both"/>
-      </w:pPr>
-      <w:r>
-        <w:rPr>
-          <w:rFonts w:ascii="Arial" w:hAnsi="Arial" w:eastAsia="Arial" w:cs="Arial"/>
-          <w:b w:val="0"/>
-          <w:i w:val="0"/>
-          <w:sz w:val="20"/>
-          <w:u w:val="none"/>
-        </w:rPr>
-        <w:t xml:space="preserve">A ATUALIZACAO da Cesta de Beneficios foi formalizada mediante o pagamento do boleto, realizado em </w:t>
-      </w:r>
-      <w:r>
-        <w:rPr>
-          <w:rFonts w:ascii="Arial" w:hAnsi="Arial" w:eastAsia="Arial" w:cs="Arial"/>
-          <w:b w:val="0"/>
-          <w:i w:val="0"/>
-          <w:sz w:val="20"/>
-          <w:u w:val="none"/>
-        </w:rPr>
-        <w:t>{{PAGTO}}</w:t>
-      </w:r>
-      <w:r>
-        <w:rPr>
-          <w:rFonts w:ascii="Arial" w:hAnsi="Arial" w:eastAsia="Arial" w:cs="Arial"/>
-          <w:b w:val="0"/>
-          <w:i w:val="0"/>
-          <w:sz w:val="20"/>
-          <w:u w:val="none"/>
-        </w:rPr>
-        <w:t>.</w:t>
-      </w:r>
-    </w:p>
-    <w:p>
-      <w:pPr>
-        <w:spacing w:before="0" w:after="0" w:line="240" w:lineRule="auto"/>
-        <w:jc w:val="both"/>
-      </w:pPr>
-      <w:r>
-        <w:rPr>
-          <w:rFonts w:ascii="Arial" w:hAnsi="Arial" w:eastAsia="Arial" w:cs="Arial"/>
-          <w:b w:val="0"/>
-          <w:i w:val="0"/>
-          <w:sz w:val="20"/>
-          <w:u w:val="none"/>
-        </w:rPr>
-      </w:r>
-    </w:p>
-    <w:p>
-      <w:pPr>
-        <w:spacing w:before="0" w:after="0" w:line="240" w:lineRule="auto"/>
-        <w:jc w:val="both"/>
-      </w:pPr>
-      <w:r>
-        <w:rPr>
-          <w:rFonts w:ascii="Arial" w:hAnsi="Arial" w:eastAsia="Arial" w:cs="Arial"/>
-          <w:b w:val="0"/>
-          <w:i w:val="0"/>
-          <w:sz w:val="20"/>
-          <w:u w:val="none"/>
-        </w:rPr>
-        <w:t>A Cesta de Beneficios esta com estes funcionarios ATIVOS:</w:t>
-      </w:r>
-    </w:p>
-    <w:p>
-      <w:pPr>
-        <w:spacing w:before="0" w:after="0" w:line="240" w:lineRule="auto"/>
-        <w:jc w:val="both"/>
-      </w:pPr>
-      <w:r>
-        <w:rPr>
-          <w:rFonts w:ascii="Arial" w:hAnsi="Arial" w:eastAsia="Arial" w:cs="Arial"/>
-          <w:b w:val="0"/>
-          <w:i w:val="0"/>
-          <w:sz w:val="20"/>
-          <w:u w:val="none"/>
-        </w:rPr>
-      </w:r>
-    </w:p>
-    <w:p>
-      <w:pPr>
-        <w:spacing w:before="0" w:after="0" w:line="240" w:lineRule="auto"/>
-        <w:jc w:val="both"/>
-      </w:pPr>
-      <w:r>
-        <w:rPr>
-          <w:rFonts w:ascii="Arial" w:hAnsi="Arial" w:eastAsia="Arial" w:cs="Arial"/>
-          <w:b w:val="0"/>
-          <w:i w:val="0"/>
-          <w:sz w:val="20"/>
-          <w:u w:val="none"/>
         </w:rPr>
         <w:t>{{LISTA_ATIVOS}}</w:t>
       </w:r>
@@ -326,21 +218,9 @@
         <w:rPr>
           <w:rFonts w:ascii="Arial" w:hAnsi="Arial" w:eastAsia="Arial" w:cs="Arial"/>
           <w:b w:val="0"/>
-          <w:i w:val="0"/>
           <w:sz w:val="20"/>
-          <w:u w:val="none"/>
         </w:rPr>
-        <w:t xml:space="preserve">Sao Paulo, </w:t>
-      </w:r>
-      <w:r>
-        <w:rPr>
-          <w:rFonts w:ascii="Arial" w:hAnsi="Arial" w:eastAsia="Arial" w:cs="Arial"/>
-          <w:b w:val="0"/>
-          <w:i w:val="0"/>
-          <w:sz w:val="20"/>
-          <w:u w:val="none"/>
-        </w:rPr>
-        <w:t>{{DATA_HOJE}}</w:t>
+        <w:t>Sao Paulo, {{DATA_HOJE}}</w:t>
       </w:r>
     </w:p>
     <w:p>
@@ -352,9 +232,7 @@
         <w:rPr>
           <w:rFonts w:ascii="Arial" w:hAnsi="Arial" w:eastAsia="Arial" w:cs="Arial"/>
           <w:b w:val="0"/>
-          <w:i w:val="0"/>
           <w:sz w:val="20"/>
-          <w:u w:val="none"/>
         </w:rPr>
         <w:t>{{ASSINATURA}}</w:t>
       </w:r>

</xml_diff>

<commit_message>
Publica template Araraquara por Matheus
</commit_message>
<xml_diff>
--- a/templates/ribeirao_preto_9fa5134b.docx
+++ b/templates/ribeirao_preto_9fa5134b.docx
@@ -47,7 +47,7 @@
           <w:sz w:val="20"/>
           <w:u w:val="none"/>
         </w:rPr>
-        <w:t>SINDICATO DOS EMPREGADOS NO COMERCIO HOTELEIRO E SIMILARES DE FRANCA E REGIÃO.</w:t>
+        <w:t>SINDICATO DOS TRABALHADORES NO COMERCIO E SERVIÇOS EM GASTRONOMIA, ALIMENTOS PREPARADOS, FAST FOODS, BEBIDAS A VAREJO E MEIOS DE HOSPEDAGEM DE ARARAQUARA E REGIAO - SINTRAGASTROH-ARA</w:t>
       </w:r>
     </w:p>
     <w:p>
@@ -79,7 +79,7 @@
           <w:sz w:val="20"/>
           <w:u w:val="none"/>
         </w:rPr>
-        <w:t>SINDICATO DE HOTEIS, RESTAURANTES, BARES E SIMILARES DE RIBEIRAO PRETO E REGIÃO (a/c.: Junior).</w:t>
+        <w:t>SINDICATO DE HOTEIS, RESTAURANTES, BARES E SIMILARES DE ARARAQUARA E REGIAO - SINHORES</w:t>
       </w:r>
     </w:p>
     <w:p>
@@ -201,7 +201,7 @@
           <w:sz w:val="20"/>
           <w:u w:val="none"/>
         </w:rPr>
-        <w:t>Informamos que a apolice do Seguro de Vida, bem como o Resumo de fatura do Plano Odontologico e suas respectivas carteirinhas estao em processo de emissao junto a Seguradora. Tao logo estejam disponiveis serao prontamente encaminhadas ao e-mail do nosso estimado cliente.</w:t>
+        <w:t>Informamos que a apolice do Seguro de Vida, esta em processo de emissao junto a Seguradora. Tao logo estejam disponiveis serao prontamente encaminhadas ao e-mail do nosso estimado cliente.</w:t>
       </w:r>
     </w:p>
     <w:p>
@@ -283,7 +283,7 @@
           <w:sz w:val="20"/>
           <w:u w:val="none"/>
         </w:rPr>
-        <w:t>A Cesta de Beneficios esta com estes funcionarios ATIVOS:</w:t>
+        <w:t>A Cesta de Beneficios esta com estes funcionarios ATIVOS :</w:t>
       </w:r>
     </w:p>
     <w:p>

</xml_diff>

<commit_message>
Publica template 10027 Sao Jose Do Rio Preto por Marcos
</commit_message>
<xml_diff>
--- a/templates/ribeirao_preto_9fa5134b.docx
+++ b/templates/ribeirao_preto_9fa5134b.docx
@@ -47,7 +47,7 @@
           <w:sz w:val="20"/>
           <w:u w:val="none"/>
         </w:rPr>
-        <w:t>SINDICATO DOS TRABALHADORES NO COMERCIO E SERVIÇOS EM GASTRONOMIA, ALIMENTOS PREPARADOS, FAST FOODS, BEBIDAS A VAREJO E MEIOS DE HOSPEDAGEM DE ARARAQUARA E REGIAO - SINTRAGASTROH-ARA</w:t>
+        <w:t>SINDICATO DOS TRABALHADORES NO COMERCIO HOTELEIRO, BARES, RESTAURANTES E SIMILARES DE SÃO JOSE DO RIO PRETO E REGIAO - (A/C LEANDRO)</w:t>
       </w:r>
     </w:p>
     <w:p>
@@ -79,7 +79,7 @@
           <w:sz w:val="20"/>
           <w:u w:val="none"/>
         </w:rPr>
-        <w:t>SINDICATO DE HOTEIS, RESTAURANTES, BARES E SIMILARES DE ARARAQUARA E REGIAO - SINHORES</w:t>
+        <w:t>SINDICATO DE HOTEIS, RESTAURANTES, BARES E SIMILARES DE SÃO JOSE DO RIO PRETO E REGIAO - SINHORES</w:t>
       </w:r>
     </w:p>
     <w:p>

</xml_diff>

<commit_message>
Publica template 10068 - ARARAQUARA por Marcos
</commit_message>
<xml_diff>
--- a/templates/ribeirao_preto_9fa5134b.docx
+++ b/templates/ribeirao_preto_9fa5134b.docx
@@ -47,7 +47,7 @@
           <w:sz w:val="20"/>
           <w:u w:val="none"/>
         </w:rPr>
-        <w:t>SINDICATO DOS TRABALHADORES NO COMERCIO HOTELEIRO, BARES, RESTAURANTES E SIMILARES DE SÃO JOSE DO RIO PRETO E REGIAO - (A/C LEANDRO)</w:t>
+        <w:t>SINDICATO DOS TRABALHADORES NO COMERCIO E SERVIÇOS EM GASTRONOMIA, ALIMENTOS PREPARADOS, FAST FOODS, BEBIDAS A VAREJO E MEIOS DE HOSPEDAGEM DE ARARAQUARA E REGIAO - SINTRAGASTROH-ARA</w:t>
       </w:r>
     </w:p>
     <w:p>
@@ -79,7 +79,7 @@
           <w:sz w:val="20"/>
           <w:u w:val="none"/>
         </w:rPr>
-        <w:t>SINDICATO DE HOTEIS, RESTAURANTES, BARES E SIMILARES DE SÃO JOSE DO RIO PRETO E REGIAO - SINHORES</w:t>
+        <w:t>SINDICATO DE HOTEIS, RESTAURANTES, BARES E SIMILARES DE ARARAQUARA E REGIAO - SINHORES</w:t>
       </w:r>
     </w:p>
     <w:p>

</xml_diff>

<commit_message>
Publica template 10003 - FRANCA por Marcos
</commit_message>
<xml_diff>
--- a/templates/ribeirao_preto_9fa5134b.docx
+++ b/templates/ribeirao_preto_9fa5134b.docx
@@ -47,7 +47,7 @@
           <w:sz w:val="20"/>
           <w:u w:val="none"/>
         </w:rPr>
-        <w:t>SINDICATO DOS TRABALHADORES NO COMERCIO E SERVIÇOS EM GASTRONOMIA, ALIMENTOS PREPARADOS, FAST FOODS, BEBIDAS A VAREJO E MEIOS DE HOSPEDAGEM DE ARARAQUARA E REGIAO - SINTRAGASTROH-ARA</w:t>
+        <w:t>SINDICATO DOS EMPREGADOS NO COMERCIO HOTELEIRO E SIMILARES DE FRANCA E REGIÃO.</w:t>
       </w:r>
     </w:p>
     <w:p>
@@ -79,7 +79,7 @@
           <w:sz w:val="20"/>
           <w:u w:val="none"/>
         </w:rPr>
-        <w:t>SINDICATO DE HOTEIS, RESTAURANTES, BARES E SIMILARES DE ARARAQUARA E REGIAO - SINHORES</w:t>
+        <w:t>SINDICATO DE HOTEIS, RESTAURANTES, BARES E SIMILARES DE RIBEIRAO PRETO E REGIÃO (a/c.: Junior).</w:t>
       </w:r>
     </w:p>
     <w:p>
@@ -201,7 +201,7 @@
           <w:sz w:val="20"/>
           <w:u w:val="none"/>
         </w:rPr>
-        <w:t>Informamos que a apolice do Seguro de Vida, esta em processo de emissao junto a Seguradora. Tao logo estejam disponiveis serao prontamente encaminhadas ao e-mail do nosso estimado cliente.</w:t>
+        <w:t>Informamos que a apolice do Seguro de Vida, bem como o Resumo de fatura do Plano Odontologico e suas respectivas carteirinhas estao em processo de emissao junto a Seguradora. Tao logo estejam disponiveis serao prontamente encaminhadas ao e-mail do nosso estimado cliente.</w:t>
       </w:r>
     </w:p>
     <w:p>

</xml_diff>

<commit_message>
Publica template 10002 - RIBEIRAO PRETO por Marcos
</commit_message>
<xml_diff>
--- a/templates/ribeirao_preto_9fa5134b.docx
+++ b/templates/ribeirao_preto_9fa5134b.docx
@@ -11,9 +11,7 @@
         <w:rPr>
           <w:rFonts w:ascii="Arial" w:hAnsi="Arial" w:eastAsia="Arial" w:cs="Arial"/>
           <w:b/>
-          <w:i w:val="0"/>
           <w:sz w:val="20"/>
-          <w:u w:val="none"/>
         </w:rPr>
         <w:t>DECLARAÇÃO</w:t>
       </w:r>
@@ -27,9 +25,7 @@
         <w:rPr>
           <w:rFonts w:ascii="Arial" w:hAnsi="Arial" w:eastAsia="Arial" w:cs="Arial"/>
           <w:b w:val="0"/>
-          <w:i w:val="0"/>
           <w:sz w:val="20"/>
-          <w:u w:val="none"/>
         </w:rPr>
         <w:t>À</w:t>
       </w:r>
@@ -43,11 +39,9 @@
         <w:rPr>
           <w:rFonts w:ascii="Arial" w:hAnsi="Arial" w:eastAsia="Arial" w:cs="Arial"/>
           <w:b w:val="0"/>
-          <w:i w:val="0"/>
           <w:sz w:val="20"/>
-          <w:u w:val="none"/>
         </w:rPr>
-        <w:t>SINDICATO DOS EMPREGADOS NO COMERCIO HOTELEIRO E SIMILARES DE FRANCA E REGIÃO.</w:t>
+        <w:t>SINDICATO DOS TRABALHADORES EM HOTEIS, RESTAURANTES, BARES E SIMILARES DE RIBEIRAO PRETO REGIAO (a/c.: Giovana).</w:t>
       </w:r>
     </w:p>
     <w:p>
@@ -59,9 +53,7 @@
         <w:rPr>
           <w:rFonts w:ascii="Arial" w:hAnsi="Arial" w:eastAsia="Arial" w:cs="Arial"/>
           <w:b w:val="0"/>
-          <w:i w:val="0"/>
           <w:sz w:val="20"/>
-          <w:u w:val="none"/>
         </w:rPr>
         <w:t>e</w:t>
       </w:r>
@@ -75,12 +67,17 @@
         <w:rPr>
           <w:rFonts w:ascii="Arial" w:hAnsi="Arial" w:eastAsia="Arial" w:cs="Arial"/>
           <w:b w:val="0"/>
-          <w:i w:val="0"/>
           <w:sz w:val="20"/>
-          <w:u w:val="none"/>
         </w:rPr>
-        <w:t>SINDICATO DE HOTEIS, RESTAURANTES, BARES E SIMILARES DE RIBEIRAO PRETO E REGIÃO (a/c.: Junior).</w:t>
+        <w:t>SINDICATO DE HOTEIS, RESTAURANTES, BARES E SIMILARES DE RIBEIRAO PRETO E REGIAO (a/c.: Junior).</w:t>
       </w:r>
+    </w:p>
+    <w:p>
+      <w:pPr>
+        <w:spacing w:before="0" w:after="0" w:line="240" w:lineRule="auto"/>
+        <w:jc w:val="both"/>
+      </w:pPr>
+      <w:r/>
     </w:p>
     <w:p>
       <w:pPr>
@@ -91,11 +88,49 @@
         <w:rPr>
           <w:rFonts w:ascii="Arial" w:hAnsi="Arial" w:eastAsia="Arial" w:cs="Arial"/>
           <w:b w:val="0"/>
-          <w:i w:val="0"/>
           <w:sz w:val="20"/>
-          <w:u w:val="none"/>
         </w:rPr>
+        <w:t xml:space="preserve">Declaramos que a empresa </w:t>
       </w:r>
+      <w:r>
+        <w:rPr>
+          <w:rFonts w:ascii="Arial" w:hAnsi="Arial" w:eastAsia="Arial" w:cs="Arial"/>
+          <w:b/>
+          <w:sz w:val="20"/>
+        </w:rPr>
+        <w:t>{{EMPRESA}} - {{CNPJ}}</w:t>
+      </w:r>
+      <w:r>
+        <w:rPr>
+          <w:rFonts w:ascii="Arial" w:hAnsi="Arial" w:eastAsia="Arial" w:cs="Arial"/>
+          <w:b w:val="0"/>
+          <w:sz w:val="20"/>
+        </w:rPr>
+        <w:t xml:space="preserve"> fez a ADESAO da Cesta de Beneficios, tendo contratado o </w:t>
+      </w:r>
+      <w:r>
+        <w:rPr>
+          <w:rFonts w:ascii="Arial" w:hAnsi="Arial" w:eastAsia="Arial" w:cs="Arial"/>
+          <w:b/>
+          <w:sz w:val="20"/>
+        </w:rPr>
+        <w:t>{{BLOCO_BENEFICIOS}}</w:t>
+      </w:r>
+      <w:r>
+        <w:rPr>
+          <w:rFonts w:ascii="Arial" w:hAnsi="Arial" w:eastAsia="Arial" w:cs="Arial"/>
+          <w:b w:val="0"/>
+          <w:sz w:val="20"/>
+        </w:rPr>
+        <w:t xml:space="preserve"> os quais atendem na integra a CLAUSULA CESTA DE BENEFICIOS.</w:t>
+      </w:r>
+    </w:p>
+    <w:p>
+      <w:pPr>
+        <w:spacing w:before="0" w:after="0" w:line="240" w:lineRule="auto"/>
+        <w:jc w:val="both"/>
+      </w:pPr>
+      <w:r/>
     </w:p>
     <w:p>
       <w:pPr>
@@ -106,72 +141,17 @@
         <w:rPr>
           <w:rFonts w:ascii="Arial" w:hAnsi="Arial" w:eastAsia="Arial" w:cs="Arial"/>
           <w:b w:val="0"/>
-          <w:i w:val="0"/>
           <w:sz w:val="20"/>
-          <w:u w:val="none"/>
         </w:rPr>
-        <w:t xml:space="preserve">Declaramos que a empresa </w:t>
+        <w:t>Informamos que a apolice do Seguro de Vida, bem como o Resumo de fatura do Plano Odontologico e suas respectivas carteirinhas estao em processo de emissao junto a Seguradora. Tao logo estejam disponiveis serao prontamente encaminhadas ao e-mail do nosso estimado cliente.</w:t>
       </w:r>
-      <w:r>
-        <w:rPr>
-          <w:rFonts w:ascii="Arial" w:hAnsi="Arial" w:eastAsia="Arial" w:cs="Arial"/>
-          <w:b w:val="0"/>
-          <w:i w:val="0"/>
-          <w:sz w:val="20"/>
-          <w:u w:val="none"/>
-        </w:rPr>
-        <w:t>{{EMPRESA}}</w:t>
-      </w:r>
-      <w:r>
-        <w:rPr>
-          <w:rFonts w:ascii="Arial" w:hAnsi="Arial" w:eastAsia="Arial" w:cs="Arial"/>
-          <w:b/>
-          <w:i w:val="0"/>
-          <w:sz w:val="20"/>
-          <w:u w:val="none"/>
-        </w:rPr>
-        <w:t xml:space="preserve"> - </w:t>
-      </w:r>
-      <w:r>
-        <w:rPr>
-          <w:rFonts w:ascii="Arial" w:hAnsi="Arial" w:eastAsia="Arial" w:cs="Arial"/>
-          <w:b w:val="0"/>
-          <w:i w:val="0"/>
-          <w:sz w:val="20"/>
-          <w:u w:val="none"/>
-        </w:rPr>
-        <w:t>{{CNPJ}}</w:t>
-      </w:r>
-      <w:r>
-        <w:rPr>
-          <w:rFonts w:ascii="Arial" w:hAnsi="Arial" w:eastAsia="Arial" w:cs="Arial"/>
-          <w:b w:val="0"/>
-          <w:i w:val="0"/>
-          <w:sz w:val="20"/>
-          <w:u w:val="none"/>
-        </w:rPr>
-        <w:t xml:space="preserve"> fez a ADESAO da Cesta de Beneficios, tendo contratado o </w:t>
-      </w:r>
-      <w:r>
-        <w:rPr>
-          <w:rFonts w:ascii="Arial" w:hAnsi="Arial" w:eastAsia="Arial" w:cs="Arial"/>
-          <w:b w:val="0"/>
-          <w:i w:val="0"/>
-          <w:sz w:val="20"/>
-          <w:u w:val="none"/>
-        </w:rPr>
-        <w:t>{{BLOCO_BENEFICIOS}}</w:t>
-      </w:r>
-      <w:r>
-        <w:rPr>
-          <w:rFonts w:ascii="Arial" w:hAnsi="Arial" w:eastAsia="Arial" w:cs="Arial"/>
-          <w:b w:val="0"/>
-          <w:i w:val="0"/>
-          <w:sz w:val="20"/>
-          <w:u w:val="none"/>
-        </w:rPr>
-        <w:t xml:space="preserve"> os quais atendem na integra a CLAUSULA CESTA DE BENEFICIOS.</w:t>
-      </w:r>
+    </w:p>
+    <w:p>
+      <w:pPr>
+        <w:spacing w:before="0" w:after="0" w:line="240" w:lineRule="auto"/>
+        <w:jc w:val="both"/>
+      </w:pPr>
+      <w:r/>
     </w:p>
     <w:p>
       <w:pPr>
@@ -182,11 +162,17 @@
         <w:rPr>
           <w:rFonts w:ascii="Arial" w:hAnsi="Arial" w:eastAsia="Arial" w:cs="Arial"/>
           <w:b w:val="0"/>
-          <w:i w:val="0"/>
           <w:sz w:val="20"/>
-          <w:u w:val="none"/>
         </w:rPr>
+        <w:t>A ATUALIZACAO da Cesta de Beneficios foi formalizada mediante o pagamento do boleto, realizado em {{PAGTO}}.</w:t>
       </w:r>
+    </w:p>
+    <w:p>
+      <w:pPr>
+        <w:spacing w:before="0" w:after="0" w:line="240" w:lineRule="auto"/>
+        <w:jc w:val="both"/>
+      </w:pPr>
+      <w:r/>
     </w:p>
     <w:p>
       <w:pPr>
@@ -197,12 +183,17 @@
         <w:rPr>
           <w:rFonts w:ascii="Arial" w:hAnsi="Arial" w:eastAsia="Arial" w:cs="Arial"/>
           <w:b w:val="0"/>
-          <w:i w:val="0"/>
           <w:sz w:val="20"/>
-          <w:u w:val="none"/>
         </w:rPr>
-        <w:t>Informamos que a apolice do Seguro de Vida, bem como o Resumo de fatura do Plano Odontologico e suas respectivas carteirinhas estao em processo de emissao junto a Seguradora. Tao logo estejam disponiveis serao prontamente encaminhadas ao e-mail do nosso estimado cliente.</w:t>
+        <w:t>A Cesta de Beneficios esta com estes funcionarios ATIVOS:</w:t>
       </w:r>
+    </w:p>
+    <w:p>
+      <w:pPr>
+        <w:spacing w:before="0" w:after="0" w:line="240" w:lineRule="auto"/>
+        <w:jc w:val="both"/>
+      </w:pPr>
+      <w:r/>
     </w:p>
     <w:p>
       <w:pPr>
@@ -213,106 +204,7 @@
         <w:rPr>
           <w:rFonts w:ascii="Arial" w:hAnsi="Arial" w:eastAsia="Arial" w:cs="Arial"/>
           <w:b w:val="0"/>
-          <w:i w:val="0"/>
           <w:sz w:val="20"/>
-          <w:u w:val="none"/>
-        </w:rPr>
-      </w:r>
-    </w:p>
-    <w:p>
-      <w:pPr>
-        <w:spacing w:before="0" w:after="0" w:line="240" w:lineRule="auto"/>
-        <w:jc w:val="both"/>
-      </w:pPr>
-      <w:r>
-        <w:rPr>
-          <w:rFonts w:ascii="Arial" w:hAnsi="Arial" w:eastAsia="Arial" w:cs="Arial"/>
-          <w:b w:val="0"/>
-          <w:i w:val="0"/>
-          <w:sz w:val="20"/>
-          <w:u w:val="none"/>
-        </w:rPr>
-        <w:t xml:space="preserve">A ATUALIZACAO da Cesta de Beneficios foi formalizada mediante o pagamento do boleto, realizado em </w:t>
-      </w:r>
-      <w:r>
-        <w:rPr>
-          <w:rFonts w:ascii="Arial" w:hAnsi="Arial" w:eastAsia="Arial" w:cs="Arial"/>
-          <w:b w:val="0"/>
-          <w:i w:val="0"/>
-          <w:sz w:val="20"/>
-          <w:u w:val="none"/>
-        </w:rPr>
-        <w:t>{{PAGTO}}</w:t>
-      </w:r>
-      <w:r>
-        <w:rPr>
-          <w:rFonts w:ascii="Arial" w:hAnsi="Arial" w:eastAsia="Arial" w:cs="Arial"/>
-          <w:b w:val="0"/>
-          <w:i w:val="0"/>
-          <w:sz w:val="20"/>
-          <w:u w:val="none"/>
-        </w:rPr>
-        <w:t>.</w:t>
-      </w:r>
-    </w:p>
-    <w:p>
-      <w:pPr>
-        <w:spacing w:before="0" w:after="0" w:line="240" w:lineRule="auto"/>
-        <w:jc w:val="both"/>
-      </w:pPr>
-      <w:r>
-        <w:rPr>
-          <w:rFonts w:ascii="Arial" w:hAnsi="Arial" w:eastAsia="Arial" w:cs="Arial"/>
-          <w:b w:val="0"/>
-          <w:i w:val="0"/>
-          <w:sz w:val="20"/>
-          <w:u w:val="none"/>
-        </w:rPr>
-      </w:r>
-    </w:p>
-    <w:p>
-      <w:pPr>
-        <w:spacing w:before="0" w:after="0" w:line="240" w:lineRule="auto"/>
-        <w:jc w:val="both"/>
-      </w:pPr>
-      <w:r>
-        <w:rPr>
-          <w:rFonts w:ascii="Arial" w:hAnsi="Arial" w:eastAsia="Arial" w:cs="Arial"/>
-          <w:b w:val="0"/>
-          <w:i w:val="0"/>
-          <w:sz w:val="20"/>
-          <w:u w:val="none"/>
-        </w:rPr>
-        <w:t>A Cesta de Beneficios esta com estes funcionarios ATIVOS:</w:t>
-      </w:r>
-    </w:p>
-    <w:p>
-      <w:pPr>
-        <w:spacing w:before="0" w:after="0" w:line="240" w:lineRule="auto"/>
-        <w:jc w:val="both"/>
-      </w:pPr>
-      <w:r>
-        <w:rPr>
-          <w:rFonts w:ascii="Arial" w:hAnsi="Arial" w:eastAsia="Arial" w:cs="Arial"/>
-          <w:b w:val="0"/>
-          <w:i w:val="0"/>
-          <w:sz w:val="20"/>
-          <w:u w:val="none"/>
-        </w:rPr>
-      </w:r>
-    </w:p>
-    <w:p>
-      <w:pPr>
-        <w:spacing w:before="0" w:after="0" w:line="240" w:lineRule="auto"/>
-        <w:jc w:val="both"/>
-      </w:pPr>
-      <w:r>
-        <w:rPr>
-          <w:rFonts w:ascii="Arial" w:hAnsi="Arial" w:eastAsia="Arial" w:cs="Arial"/>
-          <w:b w:val="0"/>
-          <w:i w:val="0"/>
-          <w:sz w:val="20"/>
-          <w:u w:val="none"/>
         </w:rPr>
         <w:t>{{LISTA_ATIVOS}}</w:t>
       </w:r>
@@ -326,21 +218,9 @@
         <w:rPr>
           <w:rFonts w:ascii="Arial" w:hAnsi="Arial" w:eastAsia="Arial" w:cs="Arial"/>
           <w:b w:val="0"/>
-          <w:i w:val="0"/>
           <w:sz w:val="20"/>
-          <w:u w:val="none"/>
         </w:rPr>
-        <w:t xml:space="preserve">Sao Paulo, </w:t>
-      </w:r>
-      <w:r>
-        <w:rPr>
-          <w:rFonts w:ascii="Arial" w:hAnsi="Arial" w:eastAsia="Arial" w:cs="Arial"/>
-          <w:b w:val="0"/>
-          <w:i w:val="0"/>
-          <w:sz w:val="20"/>
-          <w:u w:val="none"/>
-        </w:rPr>
-        <w:t>{{DATA_HOJE}}</w:t>
+        <w:t>Sao Paulo, {{DATA_HOJE}}</w:t>
       </w:r>
     </w:p>
     <w:p>
@@ -352,9 +232,7 @@
         <w:rPr>
           <w:rFonts w:ascii="Arial" w:hAnsi="Arial" w:eastAsia="Arial" w:cs="Arial"/>
           <w:b w:val="0"/>
-          <w:i w:val="0"/>
           <w:sz w:val="20"/>
-          <w:u w:val="none"/>
         </w:rPr>
         <w:t>{{ASSINATURA}}</w:t>
       </w:r>

</xml_diff>

<commit_message>
Publica template 10068 Araraquara por Matheus
</commit_message>
<xml_diff>
--- a/templates/ribeirao_preto_9fa5134b.docx
+++ b/templates/ribeirao_preto_9fa5134b.docx
@@ -11,7 +11,9 @@
         <w:rPr>
           <w:rFonts w:ascii="Arial" w:hAnsi="Arial" w:eastAsia="Arial" w:cs="Arial"/>
           <w:b/>
+          <w:i w:val="0"/>
           <w:sz w:val="20"/>
+          <w:u w:val="none"/>
         </w:rPr>
         <w:t>DECLARAÇÃO</w:t>
       </w:r>
@@ -25,7 +27,9 @@
         <w:rPr>
           <w:rFonts w:ascii="Arial" w:hAnsi="Arial" w:eastAsia="Arial" w:cs="Arial"/>
           <w:b w:val="0"/>
+          <w:i w:val="0"/>
           <w:sz w:val="20"/>
+          <w:u w:val="none"/>
         </w:rPr>
         <w:t>À</w:t>
       </w:r>
@@ -39,9 +43,11 @@
         <w:rPr>
           <w:rFonts w:ascii="Arial" w:hAnsi="Arial" w:eastAsia="Arial" w:cs="Arial"/>
           <w:b w:val="0"/>
+          <w:i w:val="0"/>
           <w:sz w:val="20"/>
+          <w:u w:val="none"/>
         </w:rPr>
-        <w:t>SINDICATO DOS TRABALHADORES EM HOTEIS, RESTAURANTES, BARES E SIMILARES DE RIBEIRAO PRETO REGIAO (a/c.: Giovana).</w:t>
+        <w:t>SINDICATO DOS TRABALHADORES NO COMERCIO E SERVIÇOS EM GASTRONOMIA, ALIMENTOS PREPARADOS, FAST FOODS, BEBIDAS A VAREJO E MEIOS DE HOSPEDAGEM DE ARARAQUARA E REGIAO - SINTRAGASTROH-ARA</w:t>
       </w:r>
     </w:p>
     <w:p>
@@ -53,7 +59,9 @@
         <w:rPr>
           <w:rFonts w:ascii="Arial" w:hAnsi="Arial" w:eastAsia="Arial" w:cs="Arial"/>
           <w:b w:val="0"/>
+          <w:i w:val="0"/>
           <w:sz w:val="20"/>
+          <w:u w:val="none"/>
         </w:rPr>
         <w:t>e</w:t>
       </w:r>
@@ -67,17 +75,12 @@
         <w:rPr>
           <w:rFonts w:ascii="Arial" w:hAnsi="Arial" w:eastAsia="Arial" w:cs="Arial"/>
           <w:b w:val="0"/>
+          <w:i w:val="0"/>
           <w:sz w:val="20"/>
+          <w:u w:val="none"/>
         </w:rPr>
-        <w:t>SINDICATO DE HOTEIS, RESTAURANTES, BARES E SIMILARES DE RIBEIRAO PRETO E REGIAO (a/c.: Junior).</w:t>
+        <w:t>SINDICATO DE HOTEIS, RESTAURANTES, BARES E SIMILARES DE ARARAQUARA E REGIAO - SINHORES</w:t>
       </w:r>
-    </w:p>
-    <w:p>
-      <w:pPr>
-        <w:spacing w:before="0" w:after="0" w:line="240" w:lineRule="auto"/>
-        <w:jc w:val="both"/>
-      </w:pPr>
-      <w:r/>
     </w:p>
     <w:p>
       <w:pPr>
@@ -88,49 +91,11 @@
         <w:rPr>
           <w:rFonts w:ascii="Arial" w:hAnsi="Arial" w:eastAsia="Arial" w:cs="Arial"/>
           <w:b w:val="0"/>
+          <w:i w:val="0"/>
           <w:sz w:val="20"/>
+          <w:u w:val="none"/>
         </w:rPr>
-        <w:t xml:space="preserve">Declaramos que a empresa </w:t>
       </w:r>
-      <w:r>
-        <w:rPr>
-          <w:rFonts w:ascii="Arial" w:hAnsi="Arial" w:eastAsia="Arial" w:cs="Arial"/>
-          <w:b/>
-          <w:sz w:val="20"/>
-        </w:rPr>
-        <w:t>{{EMPRESA}} - {{CNPJ}}</w:t>
-      </w:r>
-      <w:r>
-        <w:rPr>
-          <w:rFonts w:ascii="Arial" w:hAnsi="Arial" w:eastAsia="Arial" w:cs="Arial"/>
-          <w:b w:val="0"/>
-          <w:sz w:val="20"/>
-        </w:rPr>
-        <w:t xml:space="preserve"> fez a ADESAO da Cesta de Beneficios, tendo contratado o </w:t>
-      </w:r>
-      <w:r>
-        <w:rPr>
-          <w:rFonts w:ascii="Arial" w:hAnsi="Arial" w:eastAsia="Arial" w:cs="Arial"/>
-          <w:b/>
-          <w:sz w:val="20"/>
-        </w:rPr>
-        <w:t>{{BLOCO_BENEFICIOS}}</w:t>
-      </w:r>
-      <w:r>
-        <w:rPr>
-          <w:rFonts w:ascii="Arial" w:hAnsi="Arial" w:eastAsia="Arial" w:cs="Arial"/>
-          <w:b w:val="0"/>
-          <w:sz w:val="20"/>
-        </w:rPr>
-        <w:t xml:space="preserve"> os quais atendem na integra a CLAUSULA CESTA DE BENEFICIOS.</w:t>
-      </w:r>
-    </w:p>
-    <w:p>
-      <w:pPr>
-        <w:spacing w:before="0" w:after="0" w:line="240" w:lineRule="auto"/>
-        <w:jc w:val="both"/>
-      </w:pPr>
-      <w:r/>
     </w:p>
     <w:p>
       <w:pPr>
@@ -141,17 +106,72 @@
         <w:rPr>
           <w:rFonts w:ascii="Arial" w:hAnsi="Arial" w:eastAsia="Arial" w:cs="Arial"/>
           <w:b w:val="0"/>
+          <w:i w:val="0"/>
           <w:sz w:val="20"/>
+          <w:u w:val="none"/>
         </w:rPr>
-        <w:t>Informamos que a apolice do Seguro de Vida, bem como o Resumo de fatura do Plano Odontologico e suas respectivas carteirinhas estao em processo de emissao junto a Seguradora. Tao logo estejam disponiveis serao prontamente encaminhadas ao e-mail do nosso estimado cliente.</w:t>
+        <w:t xml:space="preserve">Declaramos que a empresa </w:t>
       </w:r>
-    </w:p>
-    <w:p>
-      <w:pPr>
-        <w:spacing w:before="0" w:after="0" w:line="240" w:lineRule="auto"/>
-        <w:jc w:val="both"/>
-      </w:pPr>
-      <w:r/>
+      <w:r>
+        <w:rPr>
+          <w:rFonts w:ascii="Arial" w:hAnsi="Arial" w:eastAsia="Arial" w:cs="Arial"/>
+          <w:b w:val="0"/>
+          <w:i w:val="0"/>
+          <w:sz w:val="20"/>
+          <w:u w:val="none"/>
+        </w:rPr>
+        <w:t>{{EMPRESA}}</w:t>
+      </w:r>
+      <w:r>
+        <w:rPr>
+          <w:rFonts w:ascii="Arial" w:hAnsi="Arial" w:eastAsia="Arial" w:cs="Arial"/>
+          <w:b/>
+          <w:i w:val="0"/>
+          <w:sz w:val="20"/>
+          <w:u w:val="none"/>
+        </w:rPr>
+        <w:t xml:space="preserve"> - </w:t>
+      </w:r>
+      <w:r>
+        <w:rPr>
+          <w:rFonts w:ascii="Arial" w:hAnsi="Arial" w:eastAsia="Arial" w:cs="Arial"/>
+          <w:b w:val="0"/>
+          <w:i w:val="0"/>
+          <w:sz w:val="20"/>
+          <w:u w:val="none"/>
+        </w:rPr>
+        <w:t>{{CNPJ}}</w:t>
+      </w:r>
+      <w:r>
+        <w:rPr>
+          <w:rFonts w:ascii="Arial" w:hAnsi="Arial" w:eastAsia="Arial" w:cs="Arial"/>
+          <w:b w:val="0"/>
+          <w:i w:val="0"/>
+          <w:sz w:val="20"/>
+          <w:u w:val="none"/>
+        </w:rPr>
+        <w:t xml:space="preserve"> fez a ADESAO da Cesta de Beneficios, tendo contratado o </w:t>
+      </w:r>
+      <w:r>
+        <w:rPr>
+          <w:rFonts w:ascii="Arial" w:hAnsi="Arial" w:eastAsia="Arial" w:cs="Arial"/>
+          <w:b w:val="0"/>
+          <w:i w:val="0"/>
+          <w:sz w:val="20"/>
+          <w:u w:val="none"/>
+        </w:rPr>
+        <w:t>{{BLOCO_BENEFICIOS}}</w:t>
+      </w:r>
+      <w:r>
+        <w:rPr>
+          <w:rFonts w:ascii="Arial" w:hAnsi="Arial" w:eastAsia="Arial" w:cs="Arial"/>
+          <w:b w:val="0"/>
+          <w:i w:val="0"/>
+          <w:sz w:val="20"/>
+          <w:u w:val="none"/>
+        </w:rPr>
+        <w:t xml:space="preserve"> os quais atendem na integra a CLAUSULA CESTA DE BENEFICIOS.</w:t>
+      </w:r>
     </w:p>
     <w:p>
       <w:pPr>
@@ -162,17 +182,11 @@
         <w:rPr>
           <w:rFonts w:ascii="Arial" w:hAnsi="Arial" w:eastAsia="Arial" w:cs="Arial"/>
           <w:b w:val="0"/>
+          <w:i w:val="0"/>
           <w:sz w:val="20"/>
+          <w:u w:val="none"/>
         </w:rPr>
-        <w:t>A ATUALIZACAO da Cesta de Beneficios foi formalizada mediante o pagamento do boleto, realizado em {{PAGTO}}.</w:t>
       </w:r>
-    </w:p>
-    <w:p>
-      <w:pPr>
-        <w:spacing w:before="0" w:after="0" w:line="240" w:lineRule="auto"/>
-        <w:jc w:val="both"/>
-      </w:pPr>
-      <w:r/>
     </w:p>
     <w:p>
       <w:pPr>
@@ -183,17 +197,12 @@
         <w:rPr>
           <w:rFonts w:ascii="Arial" w:hAnsi="Arial" w:eastAsia="Arial" w:cs="Arial"/>
           <w:b w:val="0"/>
+          <w:i w:val="0"/>
           <w:sz w:val="20"/>
+          <w:u w:val="none"/>
         </w:rPr>
-        <w:t>A Cesta de Beneficios esta com estes funcionarios ATIVOS:</w:t>
+        <w:t>Informamos que a apolice do Seguro de Vida, esta em processo de emissao junto a Seguradora. Tao logo estejam disponiveis serao prontamente encaminhadas ao e-mail do nosso estimado cliente.</w:t>
       </w:r>
-    </w:p>
-    <w:p>
-      <w:pPr>
-        <w:spacing w:before="0" w:after="0" w:line="240" w:lineRule="auto"/>
-        <w:jc w:val="both"/>
-      </w:pPr>
-      <w:r/>
     </w:p>
     <w:p>
       <w:pPr>
@@ -204,7 +213,106 @@
         <w:rPr>
           <w:rFonts w:ascii="Arial" w:hAnsi="Arial" w:eastAsia="Arial" w:cs="Arial"/>
           <w:b w:val="0"/>
+          <w:i w:val="0"/>
           <w:sz w:val="20"/>
+          <w:u w:val="none"/>
+        </w:rPr>
+      </w:r>
+    </w:p>
+    <w:p>
+      <w:pPr>
+        <w:spacing w:before="0" w:after="0" w:line="240" w:lineRule="auto"/>
+        <w:jc w:val="both"/>
+      </w:pPr>
+      <w:r>
+        <w:rPr>
+          <w:rFonts w:ascii="Arial" w:hAnsi="Arial" w:eastAsia="Arial" w:cs="Arial"/>
+          <w:b w:val="0"/>
+          <w:i w:val="0"/>
+          <w:sz w:val="20"/>
+          <w:u w:val="none"/>
+        </w:rPr>
+        <w:t xml:space="preserve">A ATUALIZACAO da Cesta de Beneficios foi formalizada mediante o pagamento do boleto, realizado em </w:t>
+      </w:r>
+      <w:r>
+        <w:rPr>
+          <w:rFonts w:ascii="Arial" w:hAnsi="Arial" w:eastAsia="Arial" w:cs="Arial"/>
+          <w:b w:val="0"/>
+          <w:i w:val="0"/>
+          <w:sz w:val="20"/>
+          <w:u w:val="none"/>
+        </w:rPr>
+        <w:t>{{PAGTO}}</w:t>
+      </w:r>
+      <w:r>
+        <w:rPr>
+          <w:rFonts w:ascii="Arial" w:hAnsi="Arial" w:eastAsia="Arial" w:cs="Arial"/>
+          <w:b w:val="0"/>
+          <w:i w:val="0"/>
+          <w:sz w:val="20"/>
+          <w:u w:val="none"/>
+        </w:rPr>
+        <w:t>.</w:t>
+      </w:r>
+    </w:p>
+    <w:p>
+      <w:pPr>
+        <w:spacing w:before="0" w:after="0" w:line="240" w:lineRule="auto"/>
+        <w:jc w:val="both"/>
+      </w:pPr>
+      <w:r>
+        <w:rPr>
+          <w:rFonts w:ascii="Arial" w:hAnsi="Arial" w:eastAsia="Arial" w:cs="Arial"/>
+          <w:b w:val="0"/>
+          <w:i w:val="0"/>
+          <w:sz w:val="20"/>
+          <w:u w:val="none"/>
+        </w:rPr>
+      </w:r>
+    </w:p>
+    <w:p>
+      <w:pPr>
+        <w:spacing w:before="0" w:after="0" w:line="240" w:lineRule="auto"/>
+        <w:jc w:val="both"/>
+      </w:pPr>
+      <w:r>
+        <w:rPr>
+          <w:rFonts w:ascii="Arial" w:hAnsi="Arial" w:eastAsia="Arial" w:cs="Arial"/>
+          <w:b w:val="0"/>
+          <w:i w:val="0"/>
+          <w:sz w:val="20"/>
+          <w:u w:val="none"/>
+        </w:rPr>
+        <w:t>A Cesta de Beneficios esta com estes funcionarios ATIVOS :</w:t>
+      </w:r>
+    </w:p>
+    <w:p>
+      <w:pPr>
+        <w:spacing w:before="0" w:after="0" w:line="240" w:lineRule="auto"/>
+        <w:jc w:val="both"/>
+      </w:pPr>
+      <w:r>
+        <w:rPr>
+          <w:rFonts w:ascii="Arial" w:hAnsi="Arial" w:eastAsia="Arial" w:cs="Arial"/>
+          <w:b w:val="0"/>
+          <w:i w:val="0"/>
+          <w:sz w:val="20"/>
+          <w:u w:val="none"/>
+        </w:rPr>
+      </w:r>
+    </w:p>
+    <w:p>
+      <w:pPr>
+        <w:spacing w:before="0" w:after="0" w:line="240" w:lineRule="auto"/>
+        <w:jc w:val="both"/>
+      </w:pPr>
+      <w:r>
+        <w:rPr>
+          <w:rFonts w:ascii="Arial" w:hAnsi="Arial" w:eastAsia="Arial" w:cs="Arial"/>
+          <w:b w:val="0"/>
+          <w:i w:val="0"/>
+          <w:sz w:val="20"/>
+          <w:u w:val="none"/>
         </w:rPr>
         <w:t>{{LISTA_ATIVOS}}</w:t>
       </w:r>
@@ -218,9 +326,21 @@
         <w:rPr>
           <w:rFonts w:ascii="Arial" w:hAnsi="Arial" w:eastAsia="Arial" w:cs="Arial"/>
           <w:b w:val="0"/>
+          <w:i w:val="0"/>
           <w:sz w:val="20"/>
+          <w:u w:val="none"/>
         </w:rPr>
-        <w:t>Sao Paulo, {{DATA_HOJE}}</w:t>
+        <w:t xml:space="preserve">Sao Paulo, </w:t>
+      </w:r>
+      <w:r>
+        <w:rPr>
+          <w:rFonts w:ascii="Arial" w:hAnsi="Arial" w:eastAsia="Arial" w:cs="Arial"/>
+          <w:b w:val="0"/>
+          <w:i w:val="0"/>
+          <w:sz w:val="20"/>
+          <w:u w:val="none"/>
+        </w:rPr>
+        <w:t>{{DATA_HOJE}}</w:t>
       </w:r>
     </w:p>
     <w:p>
@@ -232,7 +352,9 @@
         <w:rPr>
           <w:rFonts w:ascii="Arial" w:hAnsi="Arial" w:eastAsia="Arial" w:cs="Arial"/>
           <w:b w:val="0"/>
+          <w:i w:val="0"/>
           <w:sz w:val="20"/>
+          <w:u w:val="none"/>
         </w:rPr>
         <w:t>{{ASSINATURA}}</w:t>
       </w:r>

</xml_diff>

<commit_message>
Publica template 10068 Araraquara por Pedro
</commit_message>
<xml_diff>
--- a/templates/ribeirao_preto_9fa5134b.docx
+++ b/templates/ribeirao_preto_9fa5134b.docx
@@ -47,7 +47,7 @@
           <w:sz w:val="20"/>
           <w:u w:val="none"/>
         </w:rPr>
-        <w:t>SINDICATO DOS TRABALHADORES NO COMERCIO E SERVIÇOS EM GASTRONOMIA, ALIMENTOS PREPARADOS, FAST FOODS, BEBIDAS A VAREJO E MEIOS DE HOSPEDAGEM DE ARARAQUARA E REGIAO - SINTRAGASTROH-ARA</w:t>
+        <w:t>SINDICATO DOS TRABALHADORES NO COMERCIO E SERVIÇOS EM GASTRONOMIA, ALIMENTOS PREPARADOS, FAST FOODS, BEBIDAS A VAREJO E MEIOS DE HOSPEDAGEM DE ARARAQUARA E REGIAO - SINTRAGASTROH-ARA (A/C GILDO)</w:t>
       </w:r>
     </w:p>
     <w:p>
@@ -79,7 +79,7 @@
           <w:sz w:val="20"/>
           <w:u w:val="none"/>
         </w:rPr>
-        <w:t>SINDICATO DE HOTEIS, RESTAURANTES, BARES E SIMILARES DE ARARAQUARA E REGIAO - SINHORES</w:t>
+        <w:t>SINDICATO DE HOTEIS, RESTAURANTES, BARES E SIMILARES DE ARARAQUARA E REGIAO - SINHORES (A/C CARDOZO)</w:t>
       </w:r>
     </w:p>
     <w:p>
@@ -150,7 +150,7 @@
           <w:sz w:val="20"/>
           <w:u w:val="none"/>
         </w:rPr>
-        <w:t xml:space="preserve"> fez a ADESAO da Cesta de Beneficios, tendo contratado o </w:t>
+        <w:t xml:space="preserve"> fez a ADESÃO do </w:t>
       </w:r>
       <w:r>
         <w:rPr>
@@ -170,7 +170,7 @@
           <w:sz w:val="20"/>
           <w:u w:val="none"/>
         </w:rPr>
-        <w:t xml:space="preserve"> os quais atendem na integra a CLAUSULA CESTA DE BENEFICIOS.</w:t>
+        <w:t xml:space="preserve"> , os quais atendem na íntegra a CLÁUSULA DE SEGURO DE VIDA.</w:t>
       </w:r>
     </w:p>
     <w:p>
@@ -201,7 +201,7 @@
           <w:sz w:val="20"/>
           <w:u w:val="none"/>
         </w:rPr>
-        <w:t>Informamos que a apolice do Seguro de Vida, esta em processo de emissao junto a Seguradora. Tao logo estejam disponiveis serao prontamente encaminhadas ao e-mail do nosso estimado cliente.</w:t>
+        <w:t>Informamos que a apolice do Seguro de Vida com formulários NR-1, está em processo de emissão junto à Seguradora. Tão logo estejam disponiveis serao prontamente encaminhadas ao e-mail do nosso estimado cliente.</w:t>
       </w:r>
     </w:p>
     <w:p>
@@ -232,7 +232,7 @@
           <w:sz w:val="20"/>
           <w:u w:val="none"/>
         </w:rPr>
-        <w:t xml:space="preserve">A ATUALIZACAO da Cesta de Beneficios foi formalizada mediante o pagamento do boleto, realizado em </w:t>
+        <w:t xml:space="preserve">A ADESÃO foi formalizada mediante o pagamento do boleto, realizado em </w:t>
       </w:r>
       <w:r>
         <w:rPr>
@@ -283,7 +283,7 @@
           <w:sz w:val="20"/>
           <w:u w:val="none"/>
         </w:rPr>
-        <w:t>A Cesta de Beneficios esta com estes funcionarios ATIVOS :</w:t>
+        <w:t>O plano está com estes funcionarios ATIVOS :</w:t>
       </w:r>
     </w:p>
     <w:p>

</xml_diff>